<commit_message>
fix a few minor mistakes
</commit_message>
<xml_diff>
--- a/heaps/analysis/heaps_analysis_en.docx
+++ b/heaps/analysis/heaps_analysis_en.docx
@@ -1,6 +1,6 @@
 
 <file path=word/document.xml><?xml version="1.0" encoding="utf-8"?>
-<w:document xmlns:wpc="http://schemas.microsoft.com/office/word/2010/wordprocessingCanvas" xmlns:cx="http://schemas.microsoft.com/office/drawing/2014/chartex" xmlns:cx1="http://schemas.microsoft.com/office/drawing/2015/9/8/chartex" xmlns:cx2="http://schemas.microsoft.com/office/drawing/2015/10/21/chartex" xmlns:cx3="http://schemas.microsoft.com/office/drawing/2016/5/9/chartex" xmlns:cx4="http://schemas.microsoft.com/office/drawing/2016/5/10/chartex" xmlns:cx5="http://schemas.microsoft.com/office/drawing/2016/5/11/chartex" xmlns:cx6="http://schemas.microsoft.com/office/drawing/2016/5/12/chartex" xmlns:cx7="http://schemas.microsoft.com/office/drawing/2016/5/13/chartex" xmlns:cx8="http://schemas.microsoft.com/office/drawing/2016/5/14/chartex" xmlns:mc="http://schemas.openxmlformats.org/markup-compatibility/2006" xmlns:aink="http://schemas.microsoft.com/office/drawing/2016/ink" xmlns:am3d="http://schemas.microsoft.com/office/drawing/2017/model3d" xmlns:o="urn:schemas-microsoft-com:office:office" xmlns:r="http://schemas.openxmlformats.org/officeDocument/2006/relationships" xmlns:m="http://schemas.openxmlformats.org/officeDocument/2006/math" xmlns:v="urn:schemas-microsoft-com:vml" xmlns:wp14="http://schemas.microsoft.com/office/word/2010/wordprocessingDrawing" xmlns:wp="http://schemas.openxmlformats.org/drawingml/2006/wordprocessingDrawing" xmlns:w10="urn:schemas-microsoft-com:office:word" xmlns:w="http://schemas.openxmlformats.org/wordprocessingml/2006/main" xmlns:w14="http://schemas.microsoft.com/office/word/2010/wordml" xmlns:w15="http://schemas.microsoft.com/office/word/2012/wordml" xmlns:w16cex="http://schemas.microsoft.com/office/word/2018/wordml/cex" xmlns:w16cid="http://schemas.microsoft.com/office/word/2016/wordml/cid" xmlns:w16="http://schemas.microsoft.com/office/word/2018/wordml" xmlns:w16sdtdh="http://schemas.microsoft.com/office/word/2020/wordml/sdtdatahash" xmlns:w16se="http://schemas.microsoft.com/office/word/2015/wordml/symex" xmlns:wpg="http://schemas.microsoft.com/office/word/2010/wordprocessingGroup" xmlns:wpi="http://schemas.microsoft.com/office/word/2010/wordprocessingInk" xmlns:wne="http://schemas.microsoft.com/office/word/2006/wordml" xmlns:wps="http://schemas.microsoft.com/office/word/2010/wordprocessingShape" mc:Ignorable="w14 w15 w16se w16cid w16 w16cex w16sdtdh wp14">
+<w:document xmlns:wpc="http://schemas.microsoft.com/office/word/2010/wordprocessingCanvas" xmlns:cx="http://schemas.microsoft.com/office/drawing/2014/chartex" xmlns:cx1="http://schemas.microsoft.com/office/drawing/2015/9/8/chartex" xmlns:cx2="http://schemas.microsoft.com/office/drawing/2015/10/21/chartex" xmlns:cx3="http://schemas.microsoft.com/office/drawing/2016/5/9/chartex" xmlns:cx4="http://schemas.microsoft.com/office/drawing/2016/5/10/chartex" xmlns:cx5="http://schemas.microsoft.com/office/drawing/2016/5/11/chartex" xmlns:cx6="http://schemas.microsoft.com/office/drawing/2016/5/12/chartex" xmlns:cx7="http://schemas.microsoft.com/office/drawing/2016/5/13/chartex" xmlns:cx8="http://schemas.microsoft.com/office/drawing/2016/5/14/chartex" xmlns:mc="http://schemas.openxmlformats.org/markup-compatibility/2006" xmlns:aink="http://schemas.microsoft.com/office/drawing/2016/ink" xmlns:am3d="http://schemas.microsoft.com/office/drawing/2017/model3d" xmlns:o="urn:schemas-microsoft-com:office:office" xmlns:oel="http://schemas.microsoft.com/office/2019/extlst" xmlns:r="http://schemas.openxmlformats.org/officeDocument/2006/relationships" xmlns:m="http://schemas.openxmlformats.org/officeDocument/2006/math" xmlns:v="urn:schemas-microsoft-com:vml" xmlns:wp14="http://schemas.microsoft.com/office/word/2010/wordprocessingDrawing" xmlns:wp="http://schemas.openxmlformats.org/drawingml/2006/wordprocessingDrawing" xmlns:w10="urn:schemas-microsoft-com:office:word" xmlns:w="http://schemas.openxmlformats.org/wordprocessingml/2006/main" xmlns:w14="http://schemas.microsoft.com/office/word/2010/wordml" xmlns:w15="http://schemas.microsoft.com/office/word/2012/wordml" xmlns:w16cex="http://schemas.microsoft.com/office/word/2018/wordml/cex" xmlns:w16cid="http://schemas.microsoft.com/office/word/2016/wordml/cid" xmlns:w16="http://schemas.microsoft.com/office/word/2018/wordml" xmlns:w16du="http://schemas.microsoft.com/office/word/2023/wordml/word16du" xmlns:w16sdtdh="http://schemas.microsoft.com/office/word/2020/wordml/sdtdatahash" xmlns:w16sdtfl="http://schemas.microsoft.com/office/word/2024/wordml/sdtformatlock" xmlns:w16se="http://schemas.microsoft.com/office/word/2015/wordml/symex" xmlns:wpg="http://schemas.microsoft.com/office/word/2010/wordprocessingGroup" xmlns:wpi="http://schemas.microsoft.com/office/word/2010/wordprocessingInk" xmlns:wne="http://schemas.microsoft.com/office/word/2006/wordml" xmlns:wps="http://schemas.microsoft.com/office/word/2010/wordprocessingShape" mc:Ignorable="w14 w15 w16se w16cid w16 w16cex w16sdtdh w16sdtfl w16du wp14">
   <w:body>
     <w:p>
       <w:pPr>
@@ -379,7 +379,7 @@
         <w:rPr>
           <w:bCs/>
         </w:rPr>
-        <w:t xml:space="preserve"> Notice that this set needs not be finite.</w:t>
+        <w:t xml:space="preserve"> Notice that this set need not be finite.</w:t>
       </w:r>
       <w:r>
         <w:rPr>
@@ -953,10 +953,7 @@
         </m:r>
       </m:oMath>
       <w:r>
-        <w:t xml:space="preserve"> </w:t>
-      </w:r>
-      <w:r>
-        <w:t xml:space="preserve">with </w:t>
+        <w:t xml:space="preserve"> with </w:t>
       </w:r>
       <m:oMath>
         <m:r>
@@ -1524,7 +1521,7 @@
         <w:t>t</w:t>
       </w:r>
       <w:r>
-        <w:t xml:space="preserve"> winning and loosing positions</w:t>
+        <w:t xml:space="preserve"> winning and losing positions</w:t>
       </w:r>
       <w:r>
         <w:t xml:space="preserve"> or by extending the Sprague-Grundy theorem to them. First, we will </w:t>
@@ -1551,13 +1548,7 @@
           <w:rPr>
             <w:rFonts w:ascii="Cambria Math" w:hAnsi="Cambria Math"/>
           </w:rPr>
-          <m:t>B</m:t>
-        </m:r>
-        <m:r>
-          <w:rPr>
-            <w:rFonts w:ascii="Cambria Math" w:hAnsi="Cambria Math"/>
-          </w:rPr>
-          <m:t>'</m:t>
+          <m:t>B'</m:t>
         </m:r>
       </m:oMath>
       <w:r>
@@ -4117,7 +4108,7 @@
                   <w:rPr>
                     <w:rFonts w:ascii="Cambria Math" w:hAnsi="Cambria Math"/>
                   </w:rPr>
-                  <m:t>6</m:t>
+                  <m:t>4</m:t>
                 </m:r>
               </m:sup>
             </m:sSup>
@@ -4315,13 +4306,7 @@
                   <w:rPr>
                     <w:rFonts w:ascii="Cambria Math" w:hAnsi="Cambria Math"/>
                   </w:rPr>
-                  <m:t>ω0+</m:t>
-                </m:r>
-                <m:r>
-                  <w:rPr>
-                    <w:rFonts w:ascii="Cambria Math" w:hAnsi="Cambria Math"/>
-                  </w:rPr>
-                  <m:t>1</m:t>
+                  <m:t>ω0+1</m:t>
                 </m:r>
               </m:oMath>
             </m:oMathPara>
@@ -4342,13 +4327,7 @@
                   <w:rPr>
                     <w:rFonts w:ascii="Cambria Math" w:hAnsi="Cambria Math"/>
                   </w:rPr>
-                  <m:t>ω0+</m:t>
-                </m:r>
-                <m:r>
-                  <w:rPr>
-                    <w:rFonts w:ascii="Cambria Math" w:hAnsi="Cambria Math"/>
-                  </w:rPr>
-                  <m:t>2</m:t>
+                  <m:t>ω0+2</m:t>
                 </m:r>
               </m:oMath>
             </m:oMathPara>
@@ -4369,13 +4348,7 @@
                   <w:rPr>
                     <w:rFonts w:ascii="Cambria Math" w:hAnsi="Cambria Math"/>
                   </w:rPr>
-                  <m:t>ω0+</m:t>
-                </m:r>
-                <m:r>
-                  <w:rPr>
-                    <w:rFonts w:ascii="Cambria Math" w:hAnsi="Cambria Math"/>
-                  </w:rPr>
-                  <m:t>3</m:t>
+                  <m:t>ω0+3</m:t>
                 </m:r>
               </m:oMath>
             </m:oMathPara>
@@ -4417,13 +4390,7 @@
                   <w:rPr>
                     <w:rFonts w:ascii="Cambria Math" w:hAnsi="Cambria Math"/>
                   </w:rPr>
-                  <m:t>ω0+</m:t>
-                </m:r>
-                <m:r>
-                  <w:rPr>
-                    <w:rFonts w:ascii="Cambria Math" w:hAnsi="Cambria Math"/>
-                  </w:rPr>
-                  <m:t>5</m:t>
+                  <m:t>ω0+5</m:t>
                 </m:r>
               </m:oMath>
             </m:oMathPara>
@@ -4467,13 +4434,7 @@
                   <w:rPr>
                     <w:rFonts w:ascii="Cambria Math" w:hAnsi="Cambria Math"/>
                   </w:rPr>
-                  <m:t>ω0+</m:t>
-                </m:r>
-                <m:r>
-                  <w:rPr>
-                    <w:rFonts w:ascii="Cambria Math" w:hAnsi="Cambria Math"/>
-                  </w:rPr>
-                  <m:t>1</m:t>
+                  <m:t>ω0+1</m:t>
                 </m:r>
               </m:oMath>
             </m:oMathPara>
@@ -4557,13 +4518,7 @@
                   <w:rPr>
                     <w:rFonts w:ascii="Cambria Math" w:hAnsi="Cambria Math"/>
                   </w:rPr>
-                  <m:t>ω1+</m:t>
-                </m:r>
-                <m:r>
-                  <w:rPr>
-                    <w:rFonts w:ascii="Cambria Math" w:hAnsi="Cambria Math"/>
-                  </w:rPr>
-                  <m:t>3</m:t>
+                  <m:t>ω1+3</m:t>
                 </m:r>
               </m:oMath>
             </m:oMathPara>
@@ -4607,13 +4562,7 @@
                   <w:rPr>
                     <w:rFonts w:ascii="Cambria Math" w:hAnsi="Cambria Math"/>
                   </w:rPr>
-                  <m:t>ω0+</m:t>
-                </m:r>
-                <m:r>
-                  <w:rPr>
-                    <w:rFonts w:ascii="Cambria Math" w:hAnsi="Cambria Math"/>
-                  </w:rPr>
-                  <m:t>1</m:t>
+                  <m:t>ω0+1</m:t>
                 </m:r>
               </m:oMath>
             </m:oMathPara>
@@ -4634,13 +4583,7 @@
                   <w:rPr>
                     <w:rFonts w:ascii="Cambria Math" w:hAnsi="Cambria Math"/>
                   </w:rPr>
-                  <m:t>ω0+</m:t>
-                </m:r>
-                <m:r>
-                  <w:rPr>
-                    <w:rFonts w:ascii="Cambria Math" w:hAnsi="Cambria Math"/>
-                  </w:rPr>
-                  <m:t>2</m:t>
+                  <m:t>ω0+2</m:t>
                 </m:r>
               </m:oMath>
             </m:oMathPara>
@@ -4661,13 +4604,7 @@
                   <w:rPr>
                     <w:rFonts w:ascii="Cambria Math" w:hAnsi="Cambria Math"/>
                   </w:rPr>
-                  <m:t>ω0+</m:t>
-                </m:r>
-                <m:r>
-                  <w:rPr>
-                    <w:rFonts w:ascii="Cambria Math" w:hAnsi="Cambria Math"/>
-                  </w:rPr>
-                  <m:t>3</m:t>
+                  <m:t>ω0+3</m:t>
                 </m:r>
               </m:oMath>
             </m:oMathPara>
@@ -4709,13 +4646,7 @@
                   <w:rPr>
                     <w:rFonts w:ascii="Cambria Math" w:hAnsi="Cambria Math"/>
                   </w:rPr>
-                  <m:t>ω2+</m:t>
-                </m:r>
-                <m:r>
-                  <w:rPr>
-                    <w:rFonts w:ascii="Cambria Math" w:hAnsi="Cambria Math"/>
-                  </w:rPr>
-                  <m:t>1</m:t>
+                  <m:t>ω2+1</m:t>
                 </m:r>
               </m:oMath>
             </m:oMathPara>
@@ -4759,13 +4690,7 @@
                   <w:rPr>
                     <w:rFonts w:ascii="Cambria Math" w:hAnsi="Cambria Math"/>
                   </w:rPr>
-                  <m:t>ω0+</m:t>
-                </m:r>
-                <m:r>
-                  <w:rPr>
-                    <w:rFonts w:ascii="Cambria Math" w:hAnsi="Cambria Math"/>
-                  </w:rPr>
-                  <m:t>1</m:t>
+                  <m:t>ω0+1</m:t>
                 </m:r>
               </m:oMath>
             </m:oMathPara>
@@ -4786,13 +4711,7 @@
                   <w:rPr>
                     <w:rFonts w:ascii="Cambria Math" w:hAnsi="Cambria Math"/>
                   </w:rPr>
-                  <m:t>ω0+</m:t>
-                </m:r>
-                <m:r>
-                  <w:rPr>
-                    <w:rFonts w:ascii="Cambria Math" w:hAnsi="Cambria Math"/>
-                  </w:rPr>
-                  <m:t>4</m:t>
+                  <m:t>ω0+4</m:t>
                 </m:r>
               </m:oMath>
             </m:oMathPara>
@@ -6434,13 +6353,7 @@
           <w:rPr>
             <w:rFonts w:ascii="Cambria Math" w:hAnsi="Cambria Math"/>
           </w:rPr>
-          <m:t>ω0+2,ω0+3,</m:t>
-        </m:r>
-        <m:r>
-          <w:rPr>
-            <w:rFonts w:ascii="Cambria Math" w:hAnsi="Cambria Math"/>
-          </w:rPr>
-          <m:t>ω0+6,…,ω1+2,…,ω2+0,…</m:t>
+          <m:t>ω0+2,ω0+3,ω0+6,…,ω1+2,…,ω2+0,…</m:t>
         </m:r>
       </m:oMath>
       <w:r>
@@ -9243,19 +9156,7 @@
           <w:rPr>
             <w:rFonts w:ascii="Cambria Math" w:hAnsi="Cambria Math"/>
           </w:rPr>
-          <m:t>ω0+4,ω0+5,ω1+0,ω1+1</m:t>
-        </m:r>
-        <m:r>
-          <w:rPr>
-            <w:rFonts w:ascii="Cambria Math" w:hAnsi="Cambria Math"/>
-          </w:rPr>
-          <m:t>,</m:t>
-        </m:r>
-        <m:r>
-          <w:rPr>
-            <w:rFonts w:ascii="Cambria Math" w:hAnsi="Cambria Math"/>
-          </w:rPr>
-          <m:t>ω0+0,ω0+1</m:t>
+          <m:t>ω0+4,ω0+5,ω1+0,ω1+1,ω0+0,ω0+1</m:t>
         </m:r>
       </m:oMath>
       <w:r>
@@ -10901,7 +10802,7 @@
 </file>
 
 <file path=word/endnotes.xml><?xml version="1.0" encoding="utf-8"?>
-<w:endnotes xmlns:wpc="http://schemas.microsoft.com/office/word/2010/wordprocessingCanvas" xmlns:cx="http://schemas.microsoft.com/office/drawing/2014/chartex" xmlns:cx1="http://schemas.microsoft.com/office/drawing/2015/9/8/chartex" xmlns:cx2="http://schemas.microsoft.com/office/drawing/2015/10/21/chartex" xmlns:cx3="http://schemas.microsoft.com/office/drawing/2016/5/9/chartex" xmlns:cx4="http://schemas.microsoft.com/office/drawing/2016/5/10/chartex" xmlns:cx5="http://schemas.microsoft.com/office/drawing/2016/5/11/chartex" xmlns:cx6="http://schemas.microsoft.com/office/drawing/2016/5/12/chartex" xmlns:cx7="http://schemas.microsoft.com/office/drawing/2016/5/13/chartex" xmlns:cx8="http://schemas.microsoft.com/office/drawing/2016/5/14/chartex" xmlns:mc="http://schemas.openxmlformats.org/markup-compatibility/2006" xmlns:aink="http://schemas.microsoft.com/office/drawing/2016/ink" xmlns:am3d="http://schemas.microsoft.com/office/drawing/2017/model3d" xmlns:o="urn:schemas-microsoft-com:office:office" xmlns:r="http://schemas.openxmlformats.org/officeDocument/2006/relationships" xmlns:m="http://schemas.openxmlformats.org/officeDocument/2006/math" xmlns:v="urn:schemas-microsoft-com:vml" xmlns:wp14="http://schemas.microsoft.com/office/word/2010/wordprocessingDrawing" xmlns:wp="http://schemas.openxmlformats.org/drawingml/2006/wordprocessingDrawing" xmlns:w10="urn:schemas-microsoft-com:office:word" xmlns:w="http://schemas.openxmlformats.org/wordprocessingml/2006/main" xmlns:w14="http://schemas.microsoft.com/office/word/2010/wordml" xmlns:w15="http://schemas.microsoft.com/office/word/2012/wordml" xmlns:w16cex="http://schemas.microsoft.com/office/word/2018/wordml/cex" xmlns:w16cid="http://schemas.microsoft.com/office/word/2016/wordml/cid" xmlns:w16="http://schemas.microsoft.com/office/word/2018/wordml" xmlns:w16sdtdh="http://schemas.microsoft.com/office/word/2020/wordml/sdtdatahash" xmlns:w16se="http://schemas.microsoft.com/office/word/2015/wordml/symex" xmlns:wpg="http://schemas.microsoft.com/office/word/2010/wordprocessingGroup" xmlns:wpi="http://schemas.microsoft.com/office/word/2010/wordprocessingInk" xmlns:wne="http://schemas.microsoft.com/office/word/2006/wordml" xmlns:wps="http://schemas.microsoft.com/office/word/2010/wordprocessingShape" mc:Ignorable="w14 w15 w16se w16cid w16 w16cex w16sdtdh wp14">
+<w:endnotes xmlns:wpc="http://schemas.microsoft.com/office/word/2010/wordprocessingCanvas" xmlns:cx="http://schemas.microsoft.com/office/drawing/2014/chartex" xmlns:cx1="http://schemas.microsoft.com/office/drawing/2015/9/8/chartex" xmlns:cx2="http://schemas.microsoft.com/office/drawing/2015/10/21/chartex" xmlns:cx3="http://schemas.microsoft.com/office/drawing/2016/5/9/chartex" xmlns:cx4="http://schemas.microsoft.com/office/drawing/2016/5/10/chartex" xmlns:cx5="http://schemas.microsoft.com/office/drawing/2016/5/11/chartex" xmlns:cx6="http://schemas.microsoft.com/office/drawing/2016/5/12/chartex" xmlns:cx7="http://schemas.microsoft.com/office/drawing/2016/5/13/chartex" xmlns:cx8="http://schemas.microsoft.com/office/drawing/2016/5/14/chartex" xmlns:mc="http://schemas.openxmlformats.org/markup-compatibility/2006" xmlns:aink="http://schemas.microsoft.com/office/drawing/2016/ink" xmlns:am3d="http://schemas.microsoft.com/office/drawing/2017/model3d" xmlns:o="urn:schemas-microsoft-com:office:office" xmlns:oel="http://schemas.microsoft.com/office/2019/extlst" xmlns:r="http://schemas.openxmlformats.org/officeDocument/2006/relationships" xmlns:m="http://schemas.openxmlformats.org/officeDocument/2006/math" xmlns:v="urn:schemas-microsoft-com:vml" xmlns:wp14="http://schemas.microsoft.com/office/word/2010/wordprocessingDrawing" xmlns:wp="http://schemas.openxmlformats.org/drawingml/2006/wordprocessingDrawing" xmlns:w10="urn:schemas-microsoft-com:office:word" xmlns:w="http://schemas.openxmlformats.org/wordprocessingml/2006/main" xmlns:w14="http://schemas.microsoft.com/office/word/2010/wordml" xmlns:w15="http://schemas.microsoft.com/office/word/2012/wordml" xmlns:w16cex="http://schemas.microsoft.com/office/word/2018/wordml/cex" xmlns:w16cid="http://schemas.microsoft.com/office/word/2016/wordml/cid" xmlns:w16="http://schemas.microsoft.com/office/word/2018/wordml" xmlns:w16du="http://schemas.microsoft.com/office/word/2023/wordml/word16du" xmlns:w16sdtdh="http://schemas.microsoft.com/office/word/2020/wordml/sdtdatahash" xmlns:w16sdtfl="http://schemas.microsoft.com/office/word/2024/wordml/sdtformatlock" xmlns:w16se="http://schemas.microsoft.com/office/word/2015/wordml/symex" xmlns:wpg="http://schemas.microsoft.com/office/word/2010/wordprocessingGroup" xmlns:wpi="http://schemas.microsoft.com/office/word/2010/wordprocessingInk" xmlns:wne="http://schemas.microsoft.com/office/word/2006/wordml" xmlns:wps="http://schemas.microsoft.com/office/word/2010/wordprocessingShape" mc:Ignorable="w14 w15 w16se w16cid w16 w16cex w16sdtdh w16sdtfl w16du wp14">
   <w:endnote w:type="separator" w:id="-1">
     <w:p>
       <w:pPr>
@@ -10926,7 +10827,7 @@
 </file>
 
 <file path=word/footnotes.xml><?xml version="1.0" encoding="utf-8"?>
-<w:footnotes xmlns:wpc="http://schemas.microsoft.com/office/word/2010/wordprocessingCanvas" xmlns:cx="http://schemas.microsoft.com/office/drawing/2014/chartex" xmlns:cx1="http://schemas.microsoft.com/office/drawing/2015/9/8/chartex" xmlns:cx2="http://schemas.microsoft.com/office/drawing/2015/10/21/chartex" xmlns:cx3="http://schemas.microsoft.com/office/drawing/2016/5/9/chartex" xmlns:cx4="http://schemas.microsoft.com/office/drawing/2016/5/10/chartex" xmlns:cx5="http://schemas.microsoft.com/office/drawing/2016/5/11/chartex" xmlns:cx6="http://schemas.microsoft.com/office/drawing/2016/5/12/chartex" xmlns:cx7="http://schemas.microsoft.com/office/drawing/2016/5/13/chartex" xmlns:cx8="http://schemas.microsoft.com/office/drawing/2016/5/14/chartex" xmlns:mc="http://schemas.openxmlformats.org/markup-compatibility/2006" xmlns:aink="http://schemas.microsoft.com/office/drawing/2016/ink" xmlns:am3d="http://schemas.microsoft.com/office/drawing/2017/model3d" xmlns:o="urn:schemas-microsoft-com:office:office" xmlns:r="http://schemas.openxmlformats.org/officeDocument/2006/relationships" xmlns:m="http://schemas.openxmlformats.org/officeDocument/2006/math" xmlns:v="urn:schemas-microsoft-com:vml" xmlns:wp14="http://schemas.microsoft.com/office/word/2010/wordprocessingDrawing" xmlns:wp="http://schemas.openxmlformats.org/drawingml/2006/wordprocessingDrawing" xmlns:w10="urn:schemas-microsoft-com:office:word" xmlns:w="http://schemas.openxmlformats.org/wordprocessingml/2006/main" xmlns:w14="http://schemas.microsoft.com/office/word/2010/wordml" xmlns:w15="http://schemas.microsoft.com/office/word/2012/wordml" xmlns:w16cex="http://schemas.microsoft.com/office/word/2018/wordml/cex" xmlns:w16cid="http://schemas.microsoft.com/office/word/2016/wordml/cid" xmlns:w16="http://schemas.microsoft.com/office/word/2018/wordml" xmlns:w16sdtdh="http://schemas.microsoft.com/office/word/2020/wordml/sdtdatahash" xmlns:w16se="http://schemas.microsoft.com/office/word/2015/wordml/symex" xmlns:wpg="http://schemas.microsoft.com/office/word/2010/wordprocessingGroup" xmlns:wpi="http://schemas.microsoft.com/office/word/2010/wordprocessingInk" xmlns:wne="http://schemas.microsoft.com/office/word/2006/wordml" xmlns:wps="http://schemas.microsoft.com/office/word/2010/wordprocessingShape" mc:Ignorable="w14 w15 w16se w16cid w16 w16cex w16sdtdh wp14">
+<w:footnotes xmlns:wpc="http://schemas.microsoft.com/office/word/2010/wordprocessingCanvas" xmlns:cx="http://schemas.microsoft.com/office/drawing/2014/chartex" xmlns:cx1="http://schemas.microsoft.com/office/drawing/2015/9/8/chartex" xmlns:cx2="http://schemas.microsoft.com/office/drawing/2015/10/21/chartex" xmlns:cx3="http://schemas.microsoft.com/office/drawing/2016/5/9/chartex" xmlns:cx4="http://schemas.microsoft.com/office/drawing/2016/5/10/chartex" xmlns:cx5="http://schemas.microsoft.com/office/drawing/2016/5/11/chartex" xmlns:cx6="http://schemas.microsoft.com/office/drawing/2016/5/12/chartex" xmlns:cx7="http://schemas.microsoft.com/office/drawing/2016/5/13/chartex" xmlns:cx8="http://schemas.microsoft.com/office/drawing/2016/5/14/chartex" xmlns:mc="http://schemas.openxmlformats.org/markup-compatibility/2006" xmlns:aink="http://schemas.microsoft.com/office/drawing/2016/ink" xmlns:am3d="http://schemas.microsoft.com/office/drawing/2017/model3d" xmlns:o="urn:schemas-microsoft-com:office:office" xmlns:oel="http://schemas.microsoft.com/office/2019/extlst" xmlns:r="http://schemas.openxmlformats.org/officeDocument/2006/relationships" xmlns:m="http://schemas.openxmlformats.org/officeDocument/2006/math" xmlns:v="urn:schemas-microsoft-com:vml" xmlns:wp14="http://schemas.microsoft.com/office/word/2010/wordprocessingDrawing" xmlns:wp="http://schemas.openxmlformats.org/drawingml/2006/wordprocessingDrawing" xmlns:w10="urn:schemas-microsoft-com:office:word" xmlns:w="http://schemas.openxmlformats.org/wordprocessingml/2006/main" xmlns:w14="http://schemas.microsoft.com/office/word/2010/wordml" xmlns:w15="http://schemas.microsoft.com/office/word/2012/wordml" xmlns:w16cex="http://schemas.microsoft.com/office/word/2018/wordml/cex" xmlns:w16cid="http://schemas.microsoft.com/office/word/2016/wordml/cid" xmlns:w16="http://schemas.microsoft.com/office/word/2018/wordml" xmlns:w16du="http://schemas.microsoft.com/office/word/2023/wordml/word16du" xmlns:w16sdtdh="http://schemas.microsoft.com/office/word/2020/wordml/sdtdatahash" xmlns:w16sdtfl="http://schemas.microsoft.com/office/word/2024/wordml/sdtformatlock" xmlns:w16se="http://schemas.microsoft.com/office/word/2015/wordml/symex" xmlns:wpg="http://schemas.microsoft.com/office/word/2010/wordprocessingGroup" xmlns:wpi="http://schemas.microsoft.com/office/word/2010/wordprocessingInk" xmlns:wne="http://schemas.microsoft.com/office/word/2006/wordml" xmlns:wps="http://schemas.microsoft.com/office/word/2010/wordprocessingShape" mc:Ignorable="w14 w15 w16se w16cid w16 w16cex w16sdtdh w16sdtfl w16du wp14">
   <w:footnote w:type="separator" w:id="-1">
     <w:p>
       <w:pPr>
@@ -10954,7 +10855,7 @@
 </file>
 
 <file path=word/numbering.xml><?xml version="1.0" encoding="utf-8"?>
-<w:numbering xmlns:wpc="http://schemas.microsoft.com/office/word/2010/wordprocessingCanvas" xmlns:cx="http://schemas.microsoft.com/office/drawing/2014/chartex" xmlns:cx1="http://schemas.microsoft.com/office/drawing/2015/9/8/chartex" xmlns:cx2="http://schemas.microsoft.com/office/drawing/2015/10/21/chartex" xmlns:cx3="http://schemas.microsoft.com/office/drawing/2016/5/9/chartex" xmlns:cx4="http://schemas.microsoft.com/office/drawing/2016/5/10/chartex" xmlns:cx5="http://schemas.microsoft.com/office/drawing/2016/5/11/chartex" xmlns:cx6="http://schemas.microsoft.com/office/drawing/2016/5/12/chartex" xmlns:cx7="http://schemas.microsoft.com/office/drawing/2016/5/13/chartex" xmlns:cx8="http://schemas.microsoft.com/office/drawing/2016/5/14/chartex" xmlns:mc="http://schemas.openxmlformats.org/markup-compatibility/2006" xmlns:aink="http://schemas.microsoft.com/office/drawing/2016/ink" xmlns:am3d="http://schemas.microsoft.com/office/drawing/2017/model3d" xmlns:o="urn:schemas-microsoft-com:office:office" xmlns:r="http://schemas.openxmlformats.org/officeDocument/2006/relationships" xmlns:m="http://schemas.openxmlformats.org/officeDocument/2006/math" xmlns:v="urn:schemas-microsoft-com:vml" xmlns:wp14="http://schemas.microsoft.com/office/word/2010/wordprocessingDrawing" xmlns:wp="http://schemas.openxmlformats.org/drawingml/2006/wordprocessingDrawing" xmlns:w10="urn:schemas-microsoft-com:office:word" xmlns:w="http://schemas.openxmlformats.org/wordprocessingml/2006/main" xmlns:w14="http://schemas.microsoft.com/office/word/2010/wordml" xmlns:w15="http://schemas.microsoft.com/office/word/2012/wordml" xmlns:w16cex="http://schemas.microsoft.com/office/word/2018/wordml/cex" xmlns:w16cid="http://schemas.microsoft.com/office/word/2016/wordml/cid" xmlns:w16="http://schemas.microsoft.com/office/word/2018/wordml" xmlns:w16sdtdh="http://schemas.microsoft.com/office/word/2020/wordml/sdtdatahash" xmlns:w16se="http://schemas.microsoft.com/office/word/2015/wordml/symex" xmlns:wpg="http://schemas.microsoft.com/office/word/2010/wordprocessingGroup" xmlns:wpi="http://schemas.microsoft.com/office/word/2010/wordprocessingInk" xmlns:wne="http://schemas.microsoft.com/office/word/2006/wordml" xmlns:wps="http://schemas.microsoft.com/office/word/2010/wordprocessingShape" mc:Ignorable="w14 w15 w16se w16cid w16 w16cex w16sdtdh wp14">
+<w:numbering xmlns:wpc="http://schemas.microsoft.com/office/word/2010/wordprocessingCanvas" xmlns:cx="http://schemas.microsoft.com/office/drawing/2014/chartex" xmlns:cx1="http://schemas.microsoft.com/office/drawing/2015/9/8/chartex" xmlns:cx2="http://schemas.microsoft.com/office/drawing/2015/10/21/chartex" xmlns:cx3="http://schemas.microsoft.com/office/drawing/2016/5/9/chartex" xmlns:cx4="http://schemas.microsoft.com/office/drawing/2016/5/10/chartex" xmlns:cx5="http://schemas.microsoft.com/office/drawing/2016/5/11/chartex" xmlns:cx6="http://schemas.microsoft.com/office/drawing/2016/5/12/chartex" xmlns:cx7="http://schemas.microsoft.com/office/drawing/2016/5/13/chartex" xmlns:cx8="http://schemas.microsoft.com/office/drawing/2016/5/14/chartex" xmlns:mc="http://schemas.openxmlformats.org/markup-compatibility/2006" xmlns:aink="http://schemas.microsoft.com/office/drawing/2016/ink" xmlns:am3d="http://schemas.microsoft.com/office/drawing/2017/model3d" xmlns:o="urn:schemas-microsoft-com:office:office" xmlns:oel="http://schemas.microsoft.com/office/2019/extlst" xmlns:r="http://schemas.openxmlformats.org/officeDocument/2006/relationships" xmlns:m="http://schemas.openxmlformats.org/officeDocument/2006/math" xmlns:v="urn:schemas-microsoft-com:vml" xmlns:wp14="http://schemas.microsoft.com/office/word/2010/wordprocessingDrawing" xmlns:wp="http://schemas.openxmlformats.org/drawingml/2006/wordprocessingDrawing" xmlns:w10="urn:schemas-microsoft-com:office:word" xmlns:w="http://schemas.openxmlformats.org/wordprocessingml/2006/main" xmlns:w14="http://schemas.microsoft.com/office/word/2010/wordml" xmlns:w15="http://schemas.microsoft.com/office/word/2012/wordml" xmlns:w16cex="http://schemas.microsoft.com/office/word/2018/wordml/cex" xmlns:w16cid="http://schemas.microsoft.com/office/word/2016/wordml/cid" xmlns:w16="http://schemas.microsoft.com/office/word/2018/wordml" xmlns:w16du="http://schemas.microsoft.com/office/word/2023/wordml/word16du" xmlns:w16sdtdh="http://schemas.microsoft.com/office/word/2020/wordml/sdtdatahash" xmlns:w16sdtfl="http://schemas.microsoft.com/office/word/2024/wordml/sdtformatlock" xmlns:w16se="http://schemas.microsoft.com/office/word/2015/wordml/symex" xmlns:wpg="http://schemas.microsoft.com/office/word/2010/wordprocessingGroup" xmlns:wpi="http://schemas.microsoft.com/office/word/2010/wordprocessingInk" xmlns:wne="http://schemas.microsoft.com/office/word/2006/wordml" xmlns:wps="http://schemas.microsoft.com/office/word/2010/wordprocessingShape" mc:Ignorable="w14 w15 w16se w16cid w16 w16cex w16sdtdh w16sdtfl w16du wp14">
   <w:abstractNum w:abstractNumId="0" w15:restartNumberingAfterBreak="0">
     <w:nsid w:val="04915C9B"/>
     <w:multiLevelType w:val="hybridMultilevel"/>
@@ -11133,17 +11034,17 @@
       </w:pPr>
     </w:lvl>
   </w:abstractNum>
-  <w:num w:numId="1">
+  <w:num w:numId="1" w16cid:durableId="159854553">
     <w:abstractNumId w:val="0"/>
   </w:num>
-  <w:num w:numId="2">
+  <w:num w:numId="2" w16cid:durableId="212548180">
     <w:abstractNumId w:val="1"/>
   </w:num>
 </w:numbering>
 </file>
 
 <file path=word/styles.xml><?xml version="1.0" encoding="utf-8"?>
-<w:styles xmlns:mc="http://schemas.openxmlformats.org/markup-compatibility/2006" xmlns:r="http://schemas.openxmlformats.org/officeDocument/2006/relationships" xmlns:w="http://schemas.openxmlformats.org/wordprocessingml/2006/main" xmlns:w14="http://schemas.microsoft.com/office/word/2010/wordml" xmlns:w15="http://schemas.microsoft.com/office/word/2012/wordml" xmlns:w16cex="http://schemas.microsoft.com/office/word/2018/wordml/cex" xmlns:w16cid="http://schemas.microsoft.com/office/word/2016/wordml/cid" xmlns:w16="http://schemas.microsoft.com/office/word/2018/wordml" xmlns:w16sdtdh="http://schemas.microsoft.com/office/word/2020/wordml/sdtdatahash" xmlns:w16se="http://schemas.microsoft.com/office/word/2015/wordml/symex" mc:Ignorable="w14 w15 w16se w16cid w16 w16cex w16sdtdh">
+<w:styles xmlns:mc="http://schemas.openxmlformats.org/markup-compatibility/2006" xmlns:r="http://schemas.openxmlformats.org/officeDocument/2006/relationships" xmlns:w="http://schemas.openxmlformats.org/wordprocessingml/2006/main" xmlns:w14="http://schemas.microsoft.com/office/word/2010/wordml" xmlns:w15="http://schemas.microsoft.com/office/word/2012/wordml" xmlns:w16cex="http://schemas.microsoft.com/office/word/2018/wordml/cex" xmlns:w16cid="http://schemas.microsoft.com/office/word/2016/wordml/cid" xmlns:w16="http://schemas.microsoft.com/office/word/2018/wordml" xmlns:w16du="http://schemas.microsoft.com/office/word/2023/wordml/word16du" xmlns:w16sdtdh="http://schemas.microsoft.com/office/word/2020/wordml/sdtdatahash" xmlns:w16sdtfl="http://schemas.microsoft.com/office/word/2024/wordml/sdtformatlock" xmlns:w16se="http://schemas.microsoft.com/office/word/2015/wordml/symex" mc:Ignorable="w14 w15 w16se w16cid w16 w16cex w16sdtdh w16sdtfl w16du">
   <w:docDefaults>
     <w:rPrDefault>
       <w:rPr>

</xml_diff>